<commit_message>
docs: refine report evidence and attribution
</commit_message>
<xml_diff>
--- a/reports/MBA_midway_progress_report.docx
+++ b/reports/MBA_midway_progress_report.docx
@@ -277,7 +277,7 @@
         <w:spacing w:after="100"/>
       </w:pPr>
       <w:r>
-        <w:t>Branch: feat/live-randomized-stream-viewer | Commit: f8381d5 | Pull request: github.com/f-society67/MBA_Analysis/pull/1</w:t>
+        <w:t>Branch: feat/live-randomized-stream-viewer | Commit: 4b0b3f2 | Pull request: github.com/f-society67/MBA_Analysis/pull/1</w:t>
       </w:r>
     </w:p>
     <w:p>
@@ -373,23 +373,21 @@
           <w:color w:val="102A43"/>
           <w:sz w:val="16"/>
         </w:rPr>
-        <w:t>dwell = float(event["dwell_seconds"])</w:t>
-        <w:br/>
-        <w:t>if dwell &lt; self.dwell_threshold_seconds:</w:t>
-        <w:br/>
-        <w:t xml:space="preserve">    return None, "below_dwell_threshold"</w:t>
-        <w:br/>
-        <w:t>if product in state.cart:</w:t>
-        <w:br/>
-        <w:t xml:space="preserve">    return None, "product_in_cart"</w:t>
+        <w:t>best = None</w:t>
         <w:br/>
         <w:t>for cart_item in state.cart:</w:t>
         <w:br/>
         <w:t xml:space="preserve">    metrics = self.rules.lookup(cart_item, product)</w:t>
         <w:br/>
-        <w:t xml:space="preserve">    if metrics and float(metrics["lift"]) &gt;= self.min_lift:</w:t>
+        <w:t xml:space="preserve">    if not metrics or float(metrics["lift"]) &lt; self.min_lift:</w:t>
         <w:br/>
-        <w:t xml:space="preserve">        best = max(best, (float(metrics["lift"]), cart_item, metrics))</w:t>
+        <w:t xml:space="preserve">        continue</w:t>
+        <w:br/>
+        <w:t xml:space="preserve">    candidate = (float(metrics["lift"]), cart_item, metrics)</w:t>
+        <w:br/>
+        <w:t xml:space="preserve">    if best is None or candidate[0] &gt; best[0]:</w:t>
+        <w:br/>
+        <w:t xml:space="preserve">        best = candidate</w:t>
       </w:r>
     </w:p>
     <w:p>
@@ -878,7 +876,7 @@
               <w:rPr>
                 <w:sz w:val="16"/>
               </w:rPr>
-              <w:t>3,189 observed events in Redis activity counters</w:t>
+              <w:t>5,537 observed events in Redis activity counters</w:t>
             </w:r>
           </w:p>
         </w:tc>
@@ -906,7 +904,7 @@
               <w:rPr>
                 <w:sz w:val="16"/>
               </w:rPr>
-              <w:t>516 issued and 401 suppressed decisions</w:t>
+              <w:t>875 issued and 718 suppressed decisions</w:t>
             </w:r>
           </w:p>
         </w:tc>
@@ -1038,7 +1036,7 @@
               <w:rPr>
                 <w:sz w:val="16"/>
               </w:rPr>
-              <w:t>Apache Kafka 4.0.2 (KRaft)</w:t>
+              <w:t>Kafka 4.0.2 + kafka-python</w:t>
             </w:r>
           </w:p>
         </w:tc>
@@ -1051,7 +1049,7 @@
               <w:rPr>
                 <w:sz w:val="16"/>
               </w:rPr>
-              <w:t>clickstream.events and coupon.issued topics</w:t>
+              <w:t>KRaft broker; producer, consumer, and topic-admin clients</w:t>
             </w:r>
           </w:p>
         </w:tc>
@@ -1064,7 +1062,7 @@
               <w:rPr>
                 <w:sz w:val="16"/>
               </w:rPr>
-              <w:t>Durable, partitioned event log; KRaft removes ZooKeeper dependency. The same contract will feed Spark Structured Streaming.</w:t>
+              <w:t>Durable, partitioned event log without ZooKeeper. The same contract will feed Spark Structured Streaming.</w:t>
             </w:r>
           </w:p>
         </w:tc>
@@ -1079,7 +1077,7 @@
               <w:rPr>
                 <w:sz w:val="16"/>
               </w:rPr>
-              <w:t>Redis 7.4</w:t>
+              <w:t>Redis 7.4 + redis-py</w:t>
             </w:r>
           </w:p>
         </w:tc>
@@ -1243,7 +1241,7 @@
               <w:rPr>
                 <w:sz w:val="16"/>
               </w:rPr>
-              <w:t>Pandas / mlxtend / scikit-learn</w:t>
+              <w:t>Pandas / mlxtend / scikit-learn / NLTK</w:t>
             </w:r>
           </w:p>
         </w:tc>
@@ -1256,7 +1254,7 @@
               <w:rPr>
                 <w:sz w:val="16"/>
               </w:rPr>
-              <w:t>legacy notebook and provisional CSV artifact</w:t>
+              <w:t>legacy EDA, FP-Growth prototype, and product-name normalization</w:t>
             </w:r>
           </w:p>
         </w:tc>
@@ -1269,7 +1267,7 @@
               <w:rPr>
                 <w:sz w:val="16"/>
               </w:rPr>
-              <w:t>Useful for EDA/prototyping, but the current flattened rule export is not final evidence. Replace with Spark MLlib FP-Growth.</w:t>
+              <w:t>Useful for exploration, but the flattened rule export is not final evidence. Replace rule mining with Spark MLlib FP-Growth.</w:t>
             </w:r>
           </w:p>
         </w:tc>
@@ -1443,7 +1441,7 @@
                 <w:b/>
                 <w:color w:val="FFFFFF"/>
               </w:rPr>
-              <w:t>Ownership and contribution</w:t>
+              <w:t>Completed contribution</w:t>
             </w:r>
           </w:p>
         </w:tc>
@@ -1458,7 +1456,7 @@
                 <w:b/>
                 <w:color w:val="FFFFFF"/>
               </w:rPr>
-              <w:t>Handoff / acceptance</w:t>
+              <w:t>Next-stage ownership / acceptance</w:t>
             </w:r>
           </w:p>
         </w:tc>
@@ -1499,7 +1497,7 @@
               <w:rPr>
                 <w:sz w:val="16"/>
               </w:rPr>
-              <w:t>Platform and integration: Docker Compose, Kafka topics, Redis rule loading, event contract, consumer orchestration, Flask routes, SSE plumbing, run scripts, branch/PR integration.</w:t>
+              <w:t>Platform integration: Docker Compose, Kafka topics, Redis rule loader, event contract, consumer orchestration, Flask/SSE routes, run scripts, and branch/PR packaging.</w:t>
             </w:r>
           </w:p>
         </w:tc>
@@ -1512,7 +1510,7 @@
               <w:rPr>
                 <w:sz w:val="16"/>
               </w:rPr>
-              <w:t>Kafka/Redis start; schema validates; viewer and scripts are reachable.</w:t>
+              <w:t>Own distributed integration and deployment: services start reproducibly, schemas validate, checkpoints and APIs remain compatible.</w:t>
             </w:r>
           </w:p>
         </w:tc>
@@ -1553,7 +1551,7 @@
               <w:rPr>
                 <w:sz w:val="16"/>
               </w:rPr>
-              <w:t>Historical intelligence: Instacart interpretation, support/confidence/lift semantics, provisional-rule audit, Spark FP-Growth migration design, HDFS/Parquet landing and rule-quality plan.</w:t>
+              <w:t>Historical analytics: Instacart dataset collection, initial EDA/preprocessing notebook, NLTK product normalization, FP-Growth prototype, rule metrics, and provisional artifact audit.</w:t>
             </w:r>
           </w:p>
         </w:tc>
@@ -1566,7 +1564,7 @@
               <w:rPr>
                 <w:sz w:val="16"/>
               </w:rPr>
-              <w:t>One-item directional rule schema is documented; Spark output is validated before Redis publication.</w:t>
+              <w:t>Own HDFS/Parquet landing and Spark MLlib mining: publish validated one-item directional rules with lineage and run metrics.</w:t>
             </w:r>
           </w:p>
         </w:tc>
@@ -1607,7 +1605,7 @@
               <w:rPr>
                 <w:sz w:val="16"/>
               </w:rPr>
-              <w:t>Activation and quality: randomized simulator, scenario coverage, stateful coupon policy, Redis observability stream, Signal Room UI, policy tests, runtime demonstration and documentation.</w:t>
+              <w:t>Live activation and quality: randomized simulator, scenario coverage, stateful coupon policy, Redis activity stream, Signal Room UI, automated tests, and demo documentation.</w:t>
             </w:r>
           </w:p>
         </w:tc>
@@ -1620,7 +1618,7 @@
               <w:rPr>
                 <w:sz w:val="16"/>
               </w:rPr>
-              <w:t>Eligible and suppression branches are visible; tests assert thresholds, guards, idempotency, and random products.</w:t>
+              <w:t>Own streaming evaluation: both policy branches stay visible; measure latency/throughput and document coupon guardrails.</w:t>
             </w:r>
           </w:p>
         </w:tc>

</xml_diff>